<commit_message>
Checked in changes to Program.cs
</commit_message>
<xml_diff>
--- a/Documentation/Technical Specifications/KEN HR Solutions - Technical Notes.docx
+++ b/Documentation/Technical Specifications/KEN HR Solutions - Technical Notes.docx
@@ -128,23 +128,7 @@
         </w:numPr>
       </w:pPr>
       <w:r>
-        <w:t xml:space="preserve">Azure </w:t>
-      </w:r>
-      <w:proofErr w:type="spellStart"/>
-      <w:r>
-        <w:t>SignalR</w:t>
-      </w:r>
-      <w:proofErr w:type="spellEnd"/>
-      <w:r>
-        <w:t xml:space="preserve"> Service (Optional, for scaling </w:t>
-      </w:r>
-      <w:proofErr w:type="spellStart"/>
-      <w:r>
-        <w:t>realtime</w:t>
-      </w:r>
-      <w:proofErr w:type="spellEnd"/>
-      <w:r>
-        <w:t>)</w:t>
+        <w:t>Azure SignalR Service (Optional, for scaling realtime)</w:t>
       </w:r>
     </w:p>
     <w:p>
@@ -234,21 +218,8 @@
           <w:numId w:val="2"/>
         </w:numPr>
       </w:pPr>
-      <w:proofErr w:type="spellStart"/>
-      <w:r>
-        <w:t>WebAssembly</w:t>
-      </w:r>
-      <w:proofErr w:type="spellEnd"/>
-      <w:r>
-        <w:t xml:space="preserve"> (</w:t>
-      </w:r>
-      <w:proofErr w:type="spellStart"/>
-      <w:r>
-        <w:t>Wasm</w:t>
-      </w:r>
-      <w:proofErr w:type="spellEnd"/>
-      <w:r>
-        <w:t xml:space="preserve">) </w:t>
+      <w:r>
+        <w:t xml:space="preserve">WebAssembly (Wasm) </w:t>
       </w:r>
       <w:r>
         <w:t xml:space="preserve">- </w:t>
@@ -292,37 +263,13 @@
           <w:b/>
           <w:bCs/>
         </w:rPr>
-        <w:t xml:space="preserve">Blazor </w:t>
-      </w:r>
-      <w:proofErr w:type="spellStart"/>
-      <w:r>
-        <w:rPr>
-          <w:b/>
-          <w:bCs/>
-        </w:rPr>
-        <w:t>WebAssembly</w:t>
-      </w:r>
-      <w:proofErr w:type="spellEnd"/>
-      <w:r>
-        <w:rPr>
-          <w:b/>
-          <w:bCs/>
-        </w:rPr>
-        <w:t xml:space="preserve"> (Client-side)</w:t>
+        <w:t>Blazor WebAssembly (Client-side)</w:t>
       </w:r>
       <w:r>
         <w:t xml:space="preserve"> - </w:t>
       </w:r>
       <w:r>
-        <w:t xml:space="preserve">runs on </w:t>
-      </w:r>
-      <w:proofErr w:type="spellStart"/>
-      <w:r>
-        <w:t>WebAssembly</w:t>
-      </w:r>
-      <w:proofErr w:type="spellEnd"/>
-      <w:r>
-        <w:t xml:space="preserve"> and is optionally hosted as ASP.NET core app. This template can be used for web apps with rich dynamic user components</w:t>
+        <w:t>runs on WebAssembly and is optionally hosted as ASP.NET core app. This template can be used for web apps with rich dynamic user components</w:t>
       </w:r>
     </w:p>
     <w:p>
@@ -344,23 +291,7 @@
         <w:t xml:space="preserve"> - </w:t>
       </w:r>
       <w:r>
-        <w:t xml:space="preserve">the app is executed on the server side instead of in a browser. Updating UI content and handling events happen over a </w:t>
-      </w:r>
-      <w:proofErr w:type="spellStart"/>
-      <w:r>
-        <w:t>SignalR</w:t>
-      </w:r>
-      <w:proofErr w:type="spellEnd"/>
-      <w:r>
-        <w:t xml:space="preserve"> connection using the </w:t>
-      </w:r>
-      <w:proofErr w:type="spellStart"/>
-      <w:r>
-        <w:t>WebSockets</w:t>
-      </w:r>
-      <w:proofErr w:type="spellEnd"/>
-      <w:r>
-        <w:t xml:space="preserve"> protocol. Blazor allows the scaling apps to handle multiple client connections.</w:t>
+        <w:t>the app is executed on the server side instead of in a browser. Updating UI content and handling events happen over a SignalR connection using the WebSockets protocol. Blazor allows the scaling apps to handle multiple client connections.</w:t>
       </w:r>
       <w:r>
         <w:t xml:space="preserve"> </w:t>
@@ -419,7 +350,6 @@
           <w:u w:val="single"/>
         </w:rPr>
       </w:pPr>
-      <w:proofErr w:type="spellStart"/>
       <w:r>
         <w:rPr>
           <w:b/>
@@ -427,16 +357,7 @@
           <w:u w:val="single"/>
         </w:rPr>
         <w:lastRenderedPageBreak/>
-        <w:t>Github</w:t>
-      </w:r>
-      <w:proofErr w:type="spellEnd"/>
-      <w:r>
-        <w:rPr>
-          <w:b/>
-          <w:bCs/>
-          <w:u w:val="single"/>
-        </w:rPr>
-        <w:t xml:space="preserve"> Account:</w:t>
+        <w:t>Github Account:</w:t>
       </w:r>
     </w:p>
     <w:p>
@@ -459,13 +380,8 @@
     </w:p>
     <w:p>
       <w:r>
-        <w:t xml:space="preserve">User ID: </w:t>
-      </w:r>
-      <w:proofErr w:type="spellStart"/>
-      <w:r>
-        <w:t>ebrosas</w:t>
-      </w:r>
-      <w:proofErr w:type="spellEnd"/>
+        <w:t>User ID: ebrosas</w:t>
+      </w:r>
     </w:p>
     <w:p>
       <w:r>
@@ -473,21 +389,12 @@
       </w:r>
     </w:p>
     <w:p>
-      <w:proofErr w:type="spellStart"/>
       <w:r>
         <w:rPr>
           <w:b/>
           <w:bCs/>
         </w:rPr>
-        <w:t>KenSolutions</w:t>
-      </w:r>
-      <w:proofErr w:type="spellEnd"/>
-      <w:r>
-        <w:rPr>
-          <w:b/>
-          <w:bCs/>
-        </w:rPr>
-        <w:t xml:space="preserve"> Repository URL:</w:t>
+        <w:t>KenSolutions Repository URL:</w:t>
       </w:r>
       <w:r>
         <w:t xml:space="preserve"> </w:t>
@@ -512,21 +419,12 @@
           <w:bCs/>
         </w:rPr>
       </w:pPr>
-      <w:proofErr w:type="spellStart"/>
       <w:r>
         <w:rPr>
           <w:b/>
           <w:bCs/>
         </w:rPr>
-        <w:t>ZingHr</w:t>
-      </w:r>
-      <w:proofErr w:type="spellEnd"/>
-      <w:r>
-        <w:rPr>
-          <w:b/>
-          <w:bCs/>
-        </w:rPr>
-        <w:t xml:space="preserve"> Login:</w:t>
+        <w:t>ZingHr Login:</w:t>
       </w:r>
     </w:p>
     <w:p>
@@ -563,67 +461,169 @@
           <w:u w:val="single"/>
         </w:rPr>
       </w:pPr>
-      <w:proofErr w:type="spellStart"/>
       <w:r>
         <w:rPr>
           <w:b/>
           <w:bCs/>
           <w:u w:val="single"/>
         </w:rPr>
-        <w:t>KenHR</w:t>
-      </w:r>
-      <w:proofErr w:type="spellEnd"/>
-      <w:r>
+        <w:t>KenHR Login Credentials:</w:t>
+      </w:r>
+    </w:p>
+    <w:p>
+      <w:pPr>
         <w:rPr>
-          <w:b/>
-          <w:bCs/>
           <w:u w:val="single"/>
         </w:rPr>
-        <w:t xml:space="preserve"> Login Credentials:</w:t>
-      </w:r>
-    </w:p>
-    <w:p>
-      <w:r>
+      </w:pPr>
+      <w:r>
+        <w:rPr>
+          <w:u w:val="single"/>
+        </w:rPr>
         <w:t>Khalid:</w:t>
       </w:r>
     </w:p>
     <w:p>
-      <w:r>
-        <w:t xml:space="preserve">User ID: </w:t>
-      </w:r>
-      <w:proofErr w:type="spellStart"/>
-      <w:r>
-        <w:t>kjalal</w:t>
-      </w:r>
-      <w:proofErr w:type="spellEnd"/>
-    </w:p>
-    <w:p>
+      <w:pPr>
+        <w:spacing w:line="240" w:lineRule="auto"/>
+      </w:pPr>
+      <w:r>
+        <w:t>User ID: kjalal</w:t>
+      </w:r>
+    </w:p>
+    <w:p>
+      <w:pPr>
+        <w:spacing w:line="240" w:lineRule="auto"/>
+      </w:pPr>
       <w:r>
         <w:t>Password: Kenhr@123</w:t>
       </w:r>
     </w:p>
     <w:p>
-      <w:r>
-        <w:t>Naga</w:t>
-      </w:r>
-      <w:r>
-        <w:t>:</w:t>
-      </w:r>
-    </w:p>
-    <w:p>
-      <w:r>
-        <w:t xml:space="preserve">User ID: </w:t>
-      </w:r>
-      <w:proofErr w:type="spellStart"/>
-      <w:r>
-        <w:t>nagendra</w:t>
-      </w:r>
-      <w:proofErr w:type="spellEnd"/>
-    </w:p>
-    <w:p>
+      <w:pPr>
+        <w:spacing w:line="240" w:lineRule="auto"/>
+      </w:pPr>
+      <w:r>
+        <w:t>E</w:t>
+      </w:r>
+      <w:r>
+        <w:t>m</w:t>
+      </w:r>
+      <w:r>
+        <w:t xml:space="preserve">ail: </w:t>
+      </w:r>
+      <w:hyperlink r:id="rId9" w:history="1">
+        <w:r>
+          <w:rPr>
+            <w:rStyle w:val="Hyperlink"/>
+          </w:rPr>
+          <w:t>khalid.jalal@enemen.com</w:t>
+        </w:r>
+      </w:hyperlink>
+    </w:p>
+    <w:p>
+      <w:pPr>
+        <w:spacing w:line="240" w:lineRule="auto"/>
+      </w:pPr>
+      <w:r>
+        <w:t>Employee No.: 10003662</w:t>
+      </w:r>
+    </w:p>
+    <w:p>
+      <w:pPr>
+        <w:spacing w:line="240" w:lineRule="auto"/>
+      </w:pPr>
+      <w:r>
+        <w:t>Joining Date: 18/12/2013</w:t>
+      </w:r>
+    </w:p>
+    <w:p/>
+    <w:p>
+      <w:pPr>
+        <w:rPr>
+          <w:u w:val="single"/>
+        </w:rPr>
+      </w:pPr>
+      <w:r>
+        <w:rPr>
+          <w:u w:val="single"/>
+        </w:rPr>
+        <w:t>Naga:</w:t>
+      </w:r>
+    </w:p>
+    <w:p>
+      <w:pPr>
+        <w:spacing w:line="240" w:lineRule="auto"/>
+      </w:pPr>
+      <w:r>
+        <w:t>User ID: nagendra</w:t>
+      </w:r>
+    </w:p>
+    <w:p>
+      <w:pPr>
+        <w:spacing w:line="240" w:lineRule="auto"/>
+      </w:pPr>
       <w:r>
         <w:t>Password: Kenhr@123</w:t>
       </w:r>
+    </w:p>
+    <w:p>
+      <w:pPr>
+        <w:spacing w:line="240" w:lineRule="auto"/>
+      </w:pPr>
+      <w:r>
+        <w:t>Email</w:t>
+      </w:r>
+      <w:r>
+        <w:t xml:space="preserve">: </w:t>
+      </w:r>
+      <w:hyperlink r:id="rId10" w:history="1">
+        <w:r>
+          <w:rPr>
+            <w:rStyle w:val="Hyperlink"/>
+          </w:rPr>
+          <w:t>nagendra.seetharam@enemen.com</w:t>
+        </w:r>
+      </w:hyperlink>
+    </w:p>
+    <w:p>
+      <w:pPr>
+        <w:spacing w:line="240" w:lineRule="auto"/>
+      </w:pPr>
+      <w:r>
+        <w:t>Employee No.: 10003</w:t>
+      </w:r>
+      <w:r>
+        <w:t>589</w:t>
+      </w:r>
+    </w:p>
+    <w:p>
+      <w:pPr>
+        <w:spacing w:line="240" w:lineRule="auto"/>
+      </w:pPr>
+      <w:r>
+        <w:t xml:space="preserve">Joining Date: </w:t>
+      </w:r>
+      <w:r>
+        <w:t>02</w:t>
+      </w:r>
+      <w:r>
+        <w:t>/</w:t>
+      </w:r>
+      <w:r>
+        <w:t>02</w:t>
+      </w:r>
+      <w:r>
+        <w:t>/201</w:t>
+      </w:r>
+      <w:r>
+        <w:t>0</w:t>
+      </w:r>
+    </w:p>
+    <w:p>
+      <w:pPr>
+        <w:spacing w:line="240" w:lineRule="auto"/>
+      </w:pPr>
     </w:p>
     <w:p/>
     <w:p>
@@ -2213,7 +2213,6 @@
   <w:style w:type="character" w:default="1" w:styleId="DefaultParagraphFont">
     <w:name w:val="Default Paragraph Font"/>
     <w:uiPriority w:val="1"/>
-    <w:semiHidden/>
     <w:unhideWhenUsed/>
   </w:style>
   <w:style w:type="table" w:default="1" w:styleId="TableNormal">

</xml_diff>